<commit_message>
Correct lab document titles and durations
Co-authored-by: Copilot App <223556219+Copilot@users.noreply.github.com>
</commit_message>
<xml_diff>
--- a/PREL38-Pre-Ignite-Day-Lab-45min.docx
+++ b/PREL38-Pre-Ignite-Day-Lab-45min.docx
@@ -11,7 +11,7 @@
         <w:ind w:left="220"/>
       </w:pPr>
       <w:r>
-        <w:t>PREL38 Ignite-Day Lab: Operating Caldova Retail Ops with Azure SRE Agent</w:t>
+        <w:t>PREL38 Pre-Ignite-Day Lab: Operating Caldova Retail Ops with Azure SRE Agent</w:t>
       </w:r>
     </w:p>
     <w:p>
@@ -34,7 +34,7 @@
         <w:t xml:space="preserve">Core duration: </w:t>
       </w:r>
       <w:r>
-        <w:t>25 minutes of guided activities.</w:t>
+        <w:t>45 minutes of guided activities.</w:t>
       </w:r>
     </w:p>
     <w:p>

</xml_diff>